<commit_message>
Completed advanced gRPC streaming features and updated report
</commit_message>
<xml_diff>
--- a/Report.docx
+++ b/Report.docx
@@ -1772,6 +1772,7 @@
       </w:pPr>
       <w:r>
         <w:rPr>
+          <w:noProof/>
           <w:lang w:val="en-GB"/>
         </w:rPr>
         <w:drawing>
@@ -3622,6 +3623,18 @@
         </w:rPr>
         <w:t>The system implements multiple forms of remote error handling.</w:t>
       </w:r>
+      <w:r>
+        <w:rPr>
+          <w:lang w:val="en-GB"/>
+        </w:rPr>
+        <w:t xml:space="preserve"> </w:t>
+      </w:r>
+      <w:r>
+        <w:rPr>
+          <w:lang w:val="en-GB"/>
+        </w:rPr>
+        <w:t>The system also implements client-side streaming and bidirectional streaming RPC communication using gRPC. Client-side streaming was implemented in the Skills Recommendation Service, while bidirectional streaming was implemented in the Job Matching Service.</w:t>
+      </w:r>
     </w:p>
     <w:p>
       <w:pPr>
@@ -3901,7 +3914,6 @@
           <w:bCs/>
           <w:lang w:val="en-GB"/>
         </w:rPr>
-        <w:lastRenderedPageBreak/>
         <w:t>Interview Availability Validation</w:t>
       </w:r>
     </w:p>
@@ -4362,6 +4374,7 @@
         <w:rPr>
           <w:lang w:val="en-GB"/>
         </w:rPr>
+        <w:lastRenderedPageBreak/>
         <w:t>Output display section</w:t>
       </w:r>
     </w:p>
@@ -4382,7 +4395,6 @@
         <w:rPr>
           <w:lang w:val="en-GB"/>
         </w:rPr>
-        <w:lastRenderedPageBreak/>
         <w:t>The GUI sends HTTP requests to the Express controller server.</w:t>
       </w:r>
     </w:p>
@@ -4603,15 +4615,7 @@
           <w:bCs/>
           <w:lang w:val="en-GB"/>
         </w:rPr>
-        <w:t xml:space="preserve">GitHub link: </w:t>
-      </w:r>
-      <w:r>
-        <w:rPr>
-          <w:b/>
-          <w:bCs/>
-          <w:lang w:val="en-GB"/>
-        </w:rPr>
-        <w:t>https://github.com/Shane-Cosgrove/employment-hub</w:t>
+        <w:t>GitHub link: https://github.com/Shane-Cosgrove/employment-hub</w:t>
       </w:r>
     </w:p>
     <w:p>
@@ -4942,7 +4946,6 @@
         <w:rPr>
           <w:lang w:val="en-GB"/>
         </w:rPr>
-        <w:lastRenderedPageBreak/>
         <w:t>Naming services</w:t>
       </w:r>
       <w:r>
@@ -5435,7 +5438,6 @@
           <w:u w:val="single"/>
           <w:lang w:val="en-GB"/>
         </w:rPr>
-        <w:lastRenderedPageBreak/>
         <w:t>Index.html</w:t>
       </w:r>
       <w:r>
@@ -5567,6 +5569,7 @@
         <w:rPr>
           <w:b/>
           <w:bCs/>
+          <w:noProof/>
           <w:u w:val="single"/>
           <w:lang w:val="en-GB"/>
         </w:rPr>
@@ -5738,6 +5741,7 @@
       </w:r>
       <w:r>
         <w:rPr>
+          <w:noProof/>
           <w:lang w:val="en-GB"/>
         </w:rPr>
         <w:drawing>
@@ -5820,7 +5824,6 @@
           <w:u w:val="single"/>
           <w:lang w:val="en-GB"/>
         </w:rPr>
-        <w:lastRenderedPageBreak/>
         <w:t>Output for each button:</w:t>
       </w:r>
     </w:p>
@@ -5869,6 +5872,7 @@
       </w:pPr>
       <w:r>
         <w:rPr>
+          <w:noProof/>
           <w:lang w:val="en-GB"/>
         </w:rPr>
         <w:drawing>
@@ -5916,6 +5920,7 @@
       </w:pPr>
       <w:r>
         <w:rPr>
+          <w:noProof/>
           <w:lang w:val="en-GB"/>
         </w:rPr>
         <w:drawing>
@@ -6031,7 +6036,6 @@
           <w:u w:val="single"/>
           <w:lang w:val="en-GB"/>
         </w:rPr>
-        <w:lastRenderedPageBreak/>
         <w:t>Test Int</w:t>
       </w:r>
       <w:r>
@@ -6079,6 +6083,7 @@
       </w:pPr>
       <w:r>
         <w:rPr>
+          <w:noProof/>
           <w:lang w:val="en-GB"/>
         </w:rPr>
         <w:drawing>
@@ -6126,6 +6131,7 @@
       </w:pPr>
       <w:r>
         <w:rPr>
+          <w:noProof/>
           <w:lang w:val="en-GB"/>
         </w:rPr>
         <w:drawing>
@@ -6183,6 +6189,7 @@
       </w:r>
       <w:r>
         <w:rPr>
+          <w:noProof/>
           <w:lang w:val="en-GB"/>
         </w:rPr>
         <w:drawing>
@@ -6242,6 +6249,7 @@
       </w:r>
       <w:r>
         <w:rPr>
+          <w:noProof/>
           <w:lang w:val="en-GB"/>
         </w:rPr>
         <w:drawing>
@@ -6281,8 +6289,163 @@
         </w:drawing>
       </w:r>
     </w:p>
+    <w:p>
+      <w:pPr>
+        <w:rPr>
+          <w:b/>
+          <w:bCs/>
+          <w:u w:val="single"/>
+          <w:lang w:val="en-GB"/>
+        </w:rPr>
+      </w:pPr>
+      <w:r>
+        <w:rPr>
+          <w:b/>
+          <w:bCs/>
+          <w:u w:val="single"/>
+          <w:lang w:val="en-GB"/>
+        </w:rPr>
+        <w:lastRenderedPageBreak/>
+        <w:t>Client-Side Streaming RPC Output</w:t>
+      </w:r>
+    </w:p>
+    <w:p>
+      <w:pPr>
+        <w:rPr>
+          <w:b/>
+          <w:bCs/>
+          <w:u w:val="single"/>
+          <w:lang w:val="en-GB"/>
+        </w:rPr>
+      </w:pPr>
+      <w:r>
+        <w:rPr>
+          <w:b/>
+          <w:bCs/>
+          <w:u w:val="single"/>
+          <w:lang w:val="en-GB"/>
+        </w:rPr>
+        <w:drawing>
+          <wp:inline distT="0" distB="0" distL="0" distR="0" wp14:anchorId="027B5530" wp14:editId="2057CC96">
+            <wp:extent cx="5731510" cy="4438015"/>
+            <wp:effectExtent l="0" t="0" r="2540" b="635"/>
+            <wp:docPr id="1888698013" name="Picture 1"/>
+            <wp:cNvGraphicFramePr>
+              <a:graphicFrameLocks xmlns:a="http://schemas.openxmlformats.org/drawingml/2006/main" noChangeAspect="1"/>
+            </wp:cNvGraphicFramePr>
+            <a:graphic xmlns:a="http://schemas.openxmlformats.org/drawingml/2006/main">
+              <a:graphicData uri="http://schemas.openxmlformats.org/drawingml/2006/picture">
+                <pic:pic xmlns:pic="http://schemas.openxmlformats.org/drawingml/2006/picture">
+                  <pic:nvPicPr>
+                    <pic:cNvPr id="1888698013" name=""/>
+                    <pic:cNvPicPr/>
+                  </pic:nvPicPr>
+                  <pic:blipFill>
+                    <a:blip r:embed="rId16"/>
+                    <a:stretch>
+                      <a:fillRect/>
+                    </a:stretch>
+                  </pic:blipFill>
+                  <pic:spPr>
+                    <a:xfrm>
+                      <a:off x="0" y="0"/>
+                      <a:ext cx="5731510" cy="4438015"/>
+                    </a:xfrm>
+                    <a:prstGeom prst="rect">
+                      <a:avLst/>
+                    </a:prstGeom>
+                  </pic:spPr>
+                </pic:pic>
+              </a:graphicData>
+            </a:graphic>
+          </wp:inline>
+        </w:drawing>
+      </w:r>
+    </w:p>
+    <w:p>
+      <w:pPr>
+        <w:rPr>
+          <w:b/>
+          <w:bCs/>
+          <w:u w:val="single"/>
+          <w:lang w:val="en-GB"/>
+        </w:rPr>
+      </w:pPr>
+    </w:p>
+    <w:p>
+      <w:pPr>
+        <w:rPr>
+          <w:b/>
+          <w:bCs/>
+          <w:u w:val="single"/>
+          <w:lang w:val="en-GB"/>
+        </w:rPr>
+      </w:pPr>
+      <w:r>
+        <w:rPr>
+          <w:b/>
+          <w:bCs/>
+          <w:u w:val="single"/>
+          <w:lang w:val="en-GB"/>
+        </w:rPr>
+        <w:t>Bidirectional Streaming RPC Output</w:t>
+      </w:r>
+    </w:p>
+    <w:p>
+      <w:pPr>
+        <w:rPr>
+          <w:b/>
+          <w:bCs/>
+          <w:u w:val="single"/>
+          <w:lang w:val="en-GB"/>
+        </w:rPr>
+      </w:pPr>
+      <w:r>
+        <w:rPr>
+          <w:b/>
+          <w:bCs/>
+          <w:u w:val="single"/>
+          <w:lang w:val="en-GB"/>
+        </w:rPr>
+        <w:drawing>
+          <wp:inline distT="0" distB="0" distL="0" distR="0" wp14:anchorId="69F08F62" wp14:editId="241356B7">
+            <wp:extent cx="5731510" cy="2092325"/>
+            <wp:effectExtent l="0" t="0" r="2540" b="3175"/>
+            <wp:docPr id="337283515" name="Picture 1"/>
+            <wp:cNvGraphicFramePr>
+              <a:graphicFrameLocks xmlns:a="http://schemas.openxmlformats.org/drawingml/2006/main" noChangeAspect="1"/>
+            </wp:cNvGraphicFramePr>
+            <a:graphic xmlns:a="http://schemas.openxmlformats.org/drawingml/2006/main">
+              <a:graphicData uri="http://schemas.openxmlformats.org/drawingml/2006/picture">
+                <pic:pic xmlns:pic="http://schemas.openxmlformats.org/drawingml/2006/picture">
+                  <pic:nvPicPr>
+                    <pic:cNvPr id="337283515" name=""/>
+                    <pic:cNvPicPr/>
+                  </pic:nvPicPr>
+                  <pic:blipFill>
+                    <a:blip r:embed="rId17"/>
+                    <a:stretch>
+                      <a:fillRect/>
+                    </a:stretch>
+                  </pic:blipFill>
+                  <pic:spPr>
+                    <a:xfrm>
+                      <a:off x="0" y="0"/>
+                      <a:ext cx="5731510" cy="2092325"/>
+                    </a:xfrm>
+                    <a:prstGeom prst="rect">
+                      <a:avLst/>
+                    </a:prstGeom>
+                  </pic:spPr>
+                </pic:pic>
+              </a:graphicData>
+            </a:graphic>
+          </wp:inline>
+        </w:drawing>
+      </w:r>
+    </w:p>
     <w:sectPr>
-      <w:footerReference w:type="default" r:id="rId16"/>
+      <w:footerReference w:type="default" r:id="rId18"/>
       <w:pgSz w:w="11906" w:h="16838"/>
       <w:pgMar w:top="1440" w:right="1440" w:bottom="1440" w:left="1440" w:header="708" w:footer="708" w:gutter="0"/>
       <w:cols w:space="708"/>
@@ -9555,6 +9718,7 @@
   <w:style w:type="character" w:default="1" w:styleId="DefaultParagraphFont">
     <w:name w:val="Default Paragraph Font"/>
     <w:uiPriority w:val="1"/>
+    <w:semiHidden/>
     <w:unhideWhenUsed/>
   </w:style>
   <w:style w:type="table" w:default="1" w:styleId="TableNormal">

</xml_diff>